<commit_message>
Rewrite EULER cover letter to answer their four required questions
EULER's application names four specific cover-letter prompts (onboarding
owned start to finish, a playbook designed from scratch, an at-risk
onboarding saved, a Sales/Onboarding/CS handoff improved). Replaced the
generic pitch letter with direct answers, one real engagement per question:
Solenzo (GBP-first sequencing), Wix (vertical built from proof of concept),
Birdeye (utilization-review catch, 94% retention), Accelo (sequenced
implementation-plan handoff). Added application-answers.md pairing each
question with its answer for portals that want separate text fields.

Co-Authored-By: Claude Sonnet 5 <noreply@anthropic.com>
Claude-Session: https://claude.ai/code/session_019bdBL73TJYAEcMtGeys4LV
</commit_message>
<xml_diff>
--- a/applications/euler/Rotenberg Cover Letter - EULER - Onboarding Manager.docx
+++ b/applications/euler/Rotenberg Cover Letter - EULER - Onboarding Manager.docx
@@ -94,7 +94,7 @@
           <w:b w:val="0"/>
           <w:color w:val="1A1A1A"/>
         </w:rPr>
-        <w:t>EULER's onboarding function is close to the job I already held at Birdeye, just under a different name. My title there was Channel Partnerships and Customer Onboarding, and the work was onboarding a partner network onto a partnerships program, the same model your platform is built to run.</w:t>
+        <w:t>At Solenzo, I own onboarding end to end for every client, from the signed agreement through their first working deliverable. I sequence Google Business Profile setup first, before any automation, because it is the one piece of work a client can verify himself, a live, complete listing, without needing me to explain anything. That sequencing is the standard opening move for every engagement today, not a one-off choice.</w:t>
       </w:r>
     </w:p>
     <w:p>
@@ -107,7 +107,7 @@
           <w:b w:val="0"/>
           <w:color w:val="1A1A1A"/>
         </w:rPr>
-        <w:t>I onboarded and supported 15 to 20 reseller partners through go live and retained all but one (about 94%), building the training sequences and communication workflows that got each partner to value faster. At Wix, I managed a team of onboarding specialists for two years (a team of 20, later 8) and standardized the onboarding stages and handoff points they worked from. That's the same program design and cross-functional handoff work this role calls for.</w:t>
+        <w:t>At Wix, I built the onboarding process for a brand-new vertical from a blank page. It was still proof of concept, so I started by defining the CRM fields the team needed for onboarding and outbound sales, standardizing data capture before we scaled headcount, then used that structure to build new-hire training and sales training for tenured account executives. The vertical went from proof of concept to a profitable line, run consistently instead of ad hoc.</w:t>
       </w:r>
     </w:p>
     <w:p>
@@ -120,7 +120,33 @@
           <w:b w:val="0"/>
           <w:color w:val="1A1A1A"/>
         </w:rPr>
-        <w:t>I'd welcome the chance to talk through how that experience maps to what EULER needs from this role. I'm available at 303-726-5037 or jrotnbrg@gmail.com.</w:t>
+        <w:t>At Birdeye, regular utilization reviews across the 15 to 20 reseller partners I managed, not a complaint, caught it: several partners had been onboarded and trained, but adoption had quietly stalled after launch. I went back to them directly, found where the process had broken down, and rebuilt the training and communication cadence that had let them go quiet. That habit is a real part of why I retained all but one partner (about 94%) over my tenure.</w:t>
+      </w:r>
+    </w:p>
+    <w:p>
+      <w:pPr>
+        <w:spacing w:after="160"/>
+      </w:pPr>
+      <w:r>
+        <w:rPr>
+          <w:rFonts w:ascii="Calibri" w:hAnsi="Calibri"/>
+          <w:b w:val="0"/>
+          <w:color w:val="1A1A1A"/>
+        </w:rPr>
+        <w:t>At Accelo, I built the sequenced implementation plan for an incoming client before the deal closed, ranking which systems needed to change and in what order. That ranked plan became the handoff I gave the implementation team, so they inherited a decision already made about where the risk sat instead of re-interviewing the client from scratch. Implementation started executing on day one instead of losing a week to rediscovery.</w:t>
+      </w:r>
+    </w:p>
+    <w:p>
+      <w:pPr>
+        <w:spacing w:after="160"/>
+      </w:pPr>
+      <w:r>
+        <w:rPr>
+          <w:rFonts w:ascii="Calibri" w:hAnsi="Calibri"/>
+          <w:b w:val="0"/>
+          <w:color w:val="1A1A1A"/>
+        </w:rPr>
+        <w:t>I'd welcome a conversation about how these fit EULER's onboarding function. I'm available at 303-726-5037 or jrotnbrg@gmail.com.</w:t>
       </w:r>
     </w:p>
     <w:p>

</xml_diff>